<commit_message>
completed testing review and changes testing document files.
</commit_message>
<xml_diff>
--- a/docs/testing/acceptance_tests/acceptance_testing.docx
+++ b/docs/testing/acceptance_tests/acceptance_testing.docx
@@ -14,10 +14,10 @@
         <w:tblLook w:val="04A0" w:firstRow="1" w:lastRow="0" w:firstColumn="1" w:lastColumn="0" w:noHBand="0" w:noVBand="1"/>
       </w:tblPr>
       <w:tblGrid>
-        <w:gridCol w:w="2808"/>
-        <w:gridCol w:w="2934"/>
+        <w:gridCol w:w="1887"/>
+        <w:gridCol w:w="2466"/>
         <w:gridCol w:w="931"/>
-        <w:gridCol w:w="2687"/>
+        <w:gridCol w:w="4076"/>
       </w:tblGrid>
       <w:tr>
         <w:tc>
@@ -485,33 +485,65 @@
                 <w:szCs w:val="20"/>
               </w:rPr>
             </w:pPr>
-          </w:p>
-        </w:tc>
-        <w:tc>
-          <w:tcPr>
-            <w:tcW w:w="0" w:type="auto"/>
-            <w:tcBorders>
-              <w:top w:val="single" w:sz="8" w:space="0" w:color="000000"/>
-              <w:left w:val="single" w:sz="8" w:space="0" w:color="000000"/>
-              <w:bottom w:val="single" w:sz="8" w:space="0" w:color="000000"/>
-              <w:right w:val="single" w:sz="8" w:space="0" w:color="000000"/>
-            </w:tcBorders>
-            <w:tcMar>
-              <w:top w:w="100" w:type="dxa"/>
-              <w:left w:w="100" w:type="dxa"/>
-              <w:bottom w:w="100" w:type="dxa"/>
-              <w:right w:w="100" w:type="dxa"/>
-            </w:tcMar>
-            <w:hideMark/>
-          </w:tcPr>
-          <w:p>
-            <w:pPr>
-              <w:rPr>
-                <w:rFonts w:ascii="Calibri" w:hAnsi="Calibri" w:cs="Calibri"/>
-                <w:sz w:val="20"/>
-                <w:szCs w:val="20"/>
-              </w:rPr>
-            </w:pPr>
+            <w:r>
+              <w:rPr>
+                <w:rFonts w:ascii="Calibri" w:hAnsi="Calibri" w:cs="Calibri"/>
+                <w:sz w:val="20"/>
+                <w:szCs w:val="20"/>
+              </w:rPr>
+              <w:t>Pass</w:t>
+            </w:r>
+          </w:p>
+        </w:tc>
+        <w:tc>
+          <w:tcPr>
+            <w:tcW w:w="0" w:type="auto"/>
+            <w:tcBorders>
+              <w:top w:val="single" w:sz="8" w:space="0" w:color="000000"/>
+              <w:left w:val="single" w:sz="8" w:space="0" w:color="000000"/>
+              <w:bottom w:val="single" w:sz="8" w:space="0" w:color="000000"/>
+              <w:right w:val="single" w:sz="8" w:space="0" w:color="000000"/>
+            </w:tcBorders>
+            <w:tcMar>
+              <w:top w:w="100" w:type="dxa"/>
+              <w:left w:w="100" w:type="dxa"/>
+              <w:bottom w:w="100" w:type="dxa"/>
+              <w:right w:w="100" w:type="dxa"/>
+            </w:tcMar>
+            <w:hideMark/>
+          </w:tcPr>
+          <w:p>
+            <w:pPr>
+              <w:rPr>
+                <w:rFonts w:ascii="Calibri" w:hAnsi="Calibri" w:cs="Calibri"/>
+                <w:sz w:val="20"/>
+                <w:szCs w:val="20"/>
+              </w:rPr>
+            </w:pPr>
+            <w:r>
+              <w:rPr>
+                <w:rFonts w:ascii="Calibri" w:hAnsi="Calibri" w:cs="Calibri"/>
+                <w:sz w:val="20"/>
+                <w:szCs w:val="20"/>
+              </w:rPr>
+              <w:t>The integrator can easily apply auto-fill questionnaire features using AI assistance chat either (text, voice or media) however, the integrator cannot edit or update already filled project details</w:t>
+            </w:r>
+            <w:r>
+              <w:rPr>
+                <w:rFonts w:ascii="Calibri" w:hAnsi="Calibri" w:cs="Calibri"/>
+                <w:sz w:val="20"/>
+                <w:szCs w:val="20"/>
+              </w:rPr>
+              <w:t xml:space="preserve"> via AI assistant chat</w:t>
+            </w:r>
+            <w:r>
+              <w:rPr>
+                <w:rFonts w:ascii="Calibri" w:hAnsi="Calibri" w:cs="Calibri"/>
+                <w:sz w:val="20"/>
+                <w:szCs w:val="20"/>
+              </w:rPr>
+              <w:t>.</w:t>
+            </w:r>
           </w:p>
         </w:tc>
       </w:tr>
@@ -645,33 +677,129 @@
                 <w:szCs w:val="20"/>
               </w:rPr>
             </w:pPr>
-          </w:p>
-        </w:tc>
-        <w:tc>
-          <w:tcPr>
-            <w:tcW w:w="0" w:type="auto"/>
-            <w:tcBorders>
-              <w:top w:val="single" w:sz="8" w:space="0" w:color="000000"/>
-              <w:left w:val="single" w:sz="8" w:space="0" w:color="000000"/>
-              <w:bottom w:val="single" w:sz="8" w:space="0" w:color="000000"/>
-              <w:right w:val="single" w:sz="8" w:space="0" w:color="000000"/>
-            </w:tcBorders>
-            <w:tcMar>
-              <w:top w:w="100" w:type="dxa"/>
-              <w:left w:w="100" w:type="dxa"/>
-              <w:bottom w:w="100" w:type="dxa"/>
-              <w:right w:w="100" w:type="dxa"/>
-            </w:tcMar>
-            <w:hideMark/>
-          </w:tcPr>
-          <w:p>
-            <w:pPr>
-              <w:rPr>
-                <w:rFonts w:ascii="Calibri" w:hAnsi="Calibri" w:cs="Calibri"/>
-                <w:sz w:val="20"/>
-                <w:szCs w:val="20"/>
-              </w:rPr>
-            </w:pPr>
+            <w:r>
+              <w:rPr>
+                <w:rFonts w:ascii="Calibri" w:hAnsi="Calibri" w:cs="Calibri"/>
+                <w:sz w:val="20"/>
+                <w:szCs w:val="20"/>
+              </w:rPr>
+              <w:t>Pass</w:t>
+            </w:r>
+          </w:p>
+        </w:tc>
+        <w:tc>
+          <w:tcPr>
+            <w:tcW w:w="0" w:type="auto"/>
+            <w:tcBorders>
+              <w:top w:val="single" w:sz="8" w:space="0" w:color="000000"/>
+              <w:left w:val="single" w:sz="8" w:space="0" w:color="000000"/>
+              <w:bottom w:val="single" w:sz="8" w:space="0" w:color="000000"/>
+              <w:right w:val="single" w:sz="8" w:space="0" w:color="000000"/>
+            </w:tcBorders>
+            <w:tcMar>
+              <w:top w:w="100" w:type="dxa"/>
+              <w:left w:w="100" w:type="dxa"/>
+              <w:bottom w:w="100" w:type="dxa"/>
+              <w:right w:w="100" w:type="dxa"/>
+            </w:tcMar>
+            <w:hideMark/>
+          </w:tcPr>
+          <w:p>
+            <w:pPr>
+              <w:rPr>
+                <w:rFonts w:ascii="Calibri" w:hAnsi="Calibri" w:cs="Calibri"/>
+                <w:sz w:val="20"/>
+                <w:szCs w:val="20"/>
+              </w:rPr>
+            </w:pPr>
+            <w:r>
+              <w:rPr>
+                <w:rFonts w:ascii="Calibri" w:hAnsi="Calibri" w:cs="Calibri"/>
+                <w:sz w:val="20"/>
+                <w:szCs w:val="20"/>
+              </w:rPr>
+              <w:t xml:space="preserve">The integrator can request project information advice and extract field observations. The system thoroughly analyses entered parameters on each questionnaire </w:t>
+            </w:r>
+            <w:r>
+              <w:rPr>
+                <w:rFonts w:ascii="Calibri" w:hAnsi="Calibri" w:cs="Calibri"/>
+                <w:sz w:val="20"/>
+                <w:szCs w:val="20"/>
+              </w:rPr>
+              <w:t>field</w:t>
+            </w:r>
+            <w:r>
+              <w:rPr>
+                <w:rFonts w:ascii="Calibri" w:hAnsi="Calibri" w:cs="Calibri"/>
+                <w:sz w:val="20"/>
+                <w:szCs w:val="20"/>
+              </w:rPr>
+              <w:t xml:space="preserve"> also </w:t>
+            </w:r>
+            <w:r>
+              <w:rPr>
+                <w:rFonts w:ascii="Calibri" w:hAnsi="Calibri" w:cs="Calibri"/>
+                <w:sz w:val="20"/>
+                <w:szCs w:val="20"/>
+              </w:rPr>
+              <w:t>display</w:t>
+            </w:r>
+            <w:r>
+              <w:rPr>
+                <w:rFonts w:ascii="Calibri" w:hAnsi="Calibri" w:cs="Calibri"/>
+                <w:sz w:val="20"/>
+                <w:szCs w:val="20"/>
+              </w:rPr>
+              <w:t xml:space="preserve"> any errors or warning notes on </w:t>
+            </w:r>
+            <w:r>
+              <w:rPr>
+                <w:rFonts w:ascii="Calibri" w:hAnsi="Calibri" w:cs="Calibri"/>
+                <w:sz w:val="20"/>
+                <w:szCs w:val="20"/>
+              </w:rPr>
+              <w:t xml:space="preserve">each questionnaire </w:t>
+            </w:r>
+            <w:r>
+              <w:rPr>
+                <w:rFonts w:ascii="Calibri" w:hAnsi="Calibri" w:cs="Calibri"/>
+                <w:sz w:val="20"/>
+                <w:szCs w:val="20"/>
+              </w:rPr>
+              <w:t>field unless there is any error</w:t>
+            </w:r>
+            <w:r>
+              <w:rPr>
+                <w:rFonts w:ascii="Calibri" w:hAnsi="Calibri" w:cs="Calibri"/>
+                <w:sz w:val="20"/>
+                <w:szCs w:val="20"/>
+              </w:rPr>
+              <w:t xml:space="preserve"> after getting </w:t>
+            </w:r>
+            <w:r>
+              <w:rPr>
+                <w:rFonts w:ascii="Calibri" w:hAnsi="Calibri" w:cs="Calibri"/>
+                <w:sz w:val="20"/>
+                <w:szCs w:val="20"/>
+              </w:rPr>
+              <w:t>AI</w:t>
+            </w:r>
+            <w:r>
+              <w:rPr>
+                <w:rFonts w:ascii="Calibri" w:hAnsi="Calibri" w:cs="Calibri"/>
+                <w:sz w:val="20"/>
+                <w:szCs w:val="20"/>
+              </w:rPr>
+              <w:t xml:space="preserve"> advice.</w:t>
+            </w:r>
+            <w:r>
+              <w:rPr>
+                <w:rFonts w:ascii="Calibri" w:hAnsi="Calibri" w:cs="Calibri"/>
+                <w:sz w:val="20"/>
+                <w:szCs w:val="20"/>
+              </w:rPr>
+              <w:t xml:space="preserve"> </w:t>
+            </w:r>
           </w:p>
         </w:tc>
       </w:tr>
@@ -779,33 +907,49 @@
                 <w:szCs w:val="20"/>
               </w:rPr>
             </w:pPr>
-          </w:p>
-        </w:tc>
-        <w:tc>
-          <w:tcPr>
-            <w:tcW w:w="0" w:type="auto"/>
-            <w:tcBorders>
-              <w:top w:val="single" w:sz="8" w:space="0" w:color="000000"/>
-              <w:left w:val="single" w:sz="8" w:space="0" w:color="000000"/>
-              <w:bottom w:val="single" w:sz="8" w:space="0" w:color="000000"/>
-              <w:right w:val="single" w:sz="8" w:space="0" w:color="000000"/>
-            </w:tcBorders>
-            <w:tcMar>
-              <w:top w:w="100" w:type="dxa"/>
-              <w:left w:w="100" w:type="dxa"/>
-              <w:bottom w:w="100" w:type="dxa"/>
-              <w:right w:w="100" w:type="dxa"/>
-            </w:tcMar>
-            <w:hideMark/>
-          </w:tcPr>
-          <w:p>
-            <w:pPr>
-              <w:rPr>
-                <w:rFonts w:ascii="Calibri" w:hAnsi="Calibri" w:cs="Calibri"/>
-                <w:sz w:val="20"/>
-                <w:szCs w:val="20"/>
-              </w:rPr>
-            </w:pPr>
+            <w:r>
+              <w:rPr>
+                <w:rFonts w:ascii="Calibri" w:hAnsi="Calibri" w:cs="Calibri"/>
+                <w:sz w:val="20"/>
+                <w:szCs w:val="20"/>
+              </w:rPr>
+              <w:t>Pass</w:t>
+            </w:r>
+          </w:p>
+        </w:tc>
+        <w:tc>
+          <w:tcPr>
+            <w:tcW w:w="0" w:type="auto"/>
+            <w:tcBorders>
+              <w:top w:val="single" w:sz="8" w:space="0" w:color="000000"/>
+              <w:left w:val="single" w:sz="8" w:space="0" w:color="000000"/>
+              <w:bottom w:val="single" w:sz="8" w:space="0" w:color="000000"/>
+              <w:right w:val="single" w:sz="8" w:space="0" w:color="000000"/>
+            </w:tcBorders>
+            <w:tcMar>
+              <w:top w:w="100" w:type="dxa"/>
+              <w:left w:w="100" w:type="dxa"/>
+              <w:bottom w:w="100" w:type="dxa"/>
+              <w:right w:w="100" w:type="dxa"/>
+            </w:tcMar>
+            <w:hideMark/>
+          </w:tcPr>
+          <w:p>
+            <w:pPr>
+              <w:rPr>
+                <w:rFonts w:ascii="Calibri" w:hAnsi="Calibri" w:cs="Calibri"/>
+                <w:sz w:val="20"/>
+                <w:szCs w:val="20"/>
+              </w:rPr>
+            </w:pPr>
+            <w:r>
+              <w:rPr>
+                <w:rFonts w:ascii="Calibri" w:hAnsi="Calibri" w:cs="Calibri"/>
+                <w:sz w:val="20"/>
+                <w:szCs w:val="20"/>
+              </w:rPr>
+              <w:t>The integrator user can submit any draft project for the evaluation at the same time the integrator can cancel submission or do request for edit permission when the project has been locked by the evaluator.</w:t>
+            </w:r>
           </w:p>
         </w:tc>
       </w:tr>
@@ -922,33 +1066,65 @@
                 <w:szCs w:val="20"/>
               </w:rPr>
             </w:pPr>
-          </w:p>
-        </w:tc>
-        <w:tc>
-          <w:tcPr>
-            <w:tcW w:w="0" w:type="auto"/>
-            <w:tcBorders>
-              <w:top w:val="single" w:sz="8" w:space="0" w:color="000000"/>
-              <w:left w:val="single" w:sz="8" w:space="0" w:color="000000"/>
-              <w:bottom w:val="single" w:sz="8" w:space="0" w:color="000000"/>
-              <w:right w:val="single" w:sz="8" w:space="0" w:color="000000"/>
-            </w:tcBorders>
-            <w:tcMar>
-              <w:top w:w="100" w:type="dxa"/>
-              <w:left w:w="100" w:type="dxa"/>
-              <w:bottom w:w="100" w:type="dxa"/>
-              <w:right w:w="100" w:type="dxa"/>
-            </w:tcMar>
-            <w:hideMark/>
-          </w:tcPr>
-          <w:p>
-            <w:pPr>
-              <w:rPr>
-                <w:rFonts w:ascii="Calibri" w:hAnsi="Calibri" w:cs="Calibri"/>
-                <w:sz w:val="20"/>
-                <w:szCs w:val="20"/>
-              </w:rPr>
-            </w:pPr>
+            <w:r>
+              <w:rPr>
+                <w:rFonts w:ascii="Calibri" w:hAnsi="Calibri" w:cs="Calibri"/>
+                <w:sz w:val="20"/>
+                <w:szCs w:val="20"/>
+              </w:rPr>
+              <w:t>Pass</w:t>
+            </w:r>
+          </w:p>
+        </w:tc>
+        <w:tc>
+          <w:tcPr>
+            <w:tcW w:w="0" w:type="auto"/>
+            <w:tcBorders>
+              <w:top w:val="single" w:sz="8" w:space="0" w:color="000000"/>
+              <w:left w:val="single" w:sz="8" w:space="0" w:color="000000"/>
+              <w:bottom w:val="single" w:sz="8" w:space="0" w:color="000000"/>
+              <w:right w:val="single" w:sz="8" w:space="0" w:color="000000"/>
+            </w:tcBorders>
+            <w:tcMar>
+              <w:top w:w="100" w:type="dxa"/>
+              <w:left w:w="100" w:type="dxa"/>
+              <w:bottom w:w="100" w:type="dxa"/>
+              <w:right w:w="100" w:type="dxa"/>
+            </w:tcMar>
+            <w:hideMark/>
+          </w:tcPr>
+          <w:p>
+            <w:pPr>
+              <w:rPr>
+                <w:rFonts w:ascii="Calibri" w:hAnsi="Calibri" w:cs="Calibri"/>
+                <w:sz w:val="20"/>
+                <w:szCs w:val="20"/>
+              </w:rPr>
+            </w:pPr>
+            <w:r>
+              <w:rPr>
+                <w:rFonts w:ascii="Calibri" w:hAnsi="Calibri" w:cs="Calibri"/>
+                <w:sz w:val="20"/>
+                <w:szCs w:val="20"/>
+              </w:rPr>
+              <w:t xml:space="preserve">The Partner or Integrator can request for project unlock / edit permission of any locked-state project to modify any questionnaire field </w:t>
+            </w:r>
+            <w:r>
+              <w:rPr>
+                <w:rFonts w:ascii="Calibri" w:hAnsi="Calibri" w:cs="Calibri"/>
+                <w:sz w:val="20"/>
+                <w:szCs w:val="20"/>
+              </w:rPr>
+              <w:t>whereas</w:t>
+            </w:r>
+            <w:r>
+              <w:rPr>
+                <w:rFonts w:ascii="Calibri" w:hAnsi="Calibri" w:cs="Calibri"/>
+                <w:sz w:val="20"/>
+                <w:szCs w:val="20"/>
+              </w:rPr>
+              <w:t xml:space="preserve"> the evaluator can ‘approve &amp; unlock’ or request the request.</w:t>
+            </w:r>
           </w:p>
         </w:tc>
       </w:tr>
@@ -1073,40 +1249,96 @@
                 <w:szCs w:val="20"/>
               </w:rPr>
             </w:pPr>
-          </w:p>
-        </w:tc>
-        <w:tc>
-          <w:tcPr>
-            <w:tcW w:w="0" w:type="auto"/>
-            <w:tcBorders>
-              <w:top w:val="single" w:sz="8" w:space="0" w:color="000000"/>
-              <w:left w:val="single" w:sz="8" w:space="0" w:color="000000"/>
-              <w:bottom w:val="single" w:sz="8" w:space="0" w:color="000000"/>
-              <w:right w:val="single" w:sz="8" w:space="0" w:color="000000"/>
-            </w:tcBorders>
-            <w:tcMar>
-              <w:top w:w="100" w:type="dxa"/>
-              <w:left w:w="100" w:type="dxa"/>
-              <w:bottom w:w="100" w:type="dxa"/>
-              <w:right w:w="100" w:type="dxa"/>
-            </w:tcMar>
-            <w:hideMark/>
-          </w:tcPr>
-          <w:p>
-            <w:pPr>
-              <w:rPr>
-                <w:rFonts w:ascii="Calibri" w:hAnsi="Calibri" w:cs="Calibri"/>
-                <w:sz w:val="20"/>
-                <w:szCs w:val="20"/>
-              </w:rPr>
-            </w:pPr>
-            <w:r>
-              <w:rPr>
-                <w:rFonts w:ascii="Calibri" w:hAnsi="Calibri" w:cs="Calibri"/>
-                <w:sz w:val="20"/>
-                <w:szCs w:val="20"/>
-              </w:rPr>
-              <w:br/>
+            <w:r>
+              <w:rPr>
+                <w:rFonts w:ascii="Calibri" w:hAnsi="Calibri" w:cs="Calibri"/>
+                <w:sz w:val="20"/>
+                <w:szCs w:val="20"/>
+              </w:rPr>
+              <w:t>Pass</w:t>
+            </w:r>
+          </w:p>
+        </w:tc>
+        <w:tc>
+          <w:tcPr>
+            <w:tcW w:w="0" w:type="auto"/>
+            <w:tcBorders>
+              <w:top w:val="single" w:sz="8" w:space="0" w:color="000000"/>
+              <w:left w:val="single" w:sz="8" w:space="0" w:color="000000"/>
+              <w:bottom w:val="single" w:sz="8" w:space="0" w:color="000000"/>
+              <w:right w:val="single" w:sz="8" w:space="0" w:color="000000"/>
+            </w:tcBorders>
+            <w:tcMar>
+              <w:top w:w="100" w:type="dxa"/>
+              <w:left w:w="100" w:type="dxa"/>
+              <w:bottom w:w="100" w:type="dxa"/>
+              <w:right w:w="100" w:type="dxa"/>
+            </w:tcMar>
+            <w:hideMark/>
+          </w:tcPr>
+          <w:p>
+            <w:pPr>
+              <w:rPr>
+                <w:rFonts w:ascii="Calibri" w:hAnsi="Calibri" w:cs="Calibri"/>
+                <w:sz w:val="20"/>
+                <w:szCs w:val="20"/>
+              </w:rPr>
+            </w:pPr>
+            <w:r>
+              <w:rPr>
+                <w:rFonts w:ascii="Calibri" w:hAnsi="Calibri" w:cs="Calibri"/>
+                <w:sz w:val="20"/>
+                <w:szCs w:val="20"/>
+              </w:rPr>
+              <w:t xml:space="preserve">The Scape App Engineer </w:t>
+            </w:r>
+            <w:r>
+              <w:rPr>
+                <w:rFonts w:ascii="Calibri" w:hAnsi="Calibri" w:cs="Calibri"/>
+                <w:sz w:val="20"/>
+                <w:szCs w:val="20"/>
+              </w:rPr>
+              <w:t xml:space="preserve">can begin </w:t>
+            </w:r>
+            <w:r>
+              <w:rPr>
+                <w:rFonts w:ascii="Calibri" w:hAnsi="Calibri" w:cs="Calibri"/>
+                <w:sz w:val="20"/>
+                <w:szCs w:val="20"/>
+              </w:rPr>
+              <w:t>evalua</w:t>
+            </w:r>
+            <w:r>
+              <w:rPr>
+                <w:rFonts w:ascii="Calibri" w:hAnsi="Calibri" w:cs="Calibri"/>
+                <w:sz w:val="20"/>
+                <w:szCs w:val="20"/>
+              </w:rPr>
+              <w:t>tion &amp; lock</w:t>
+            </w:r>
+            <w:r>
+              <w:rPr>
+                <w:rFonts w:ascii="Calibri" w:hAnsi="Calibri" w:cs="Calibri"/>
+                <w:sz w:val="20"/>
+                <w:szCs w:val="20"/>
+              </w:rPr>
+              <w:t xml:space="preserve"> the submitted project</w:t>
+            </w:r>
+            <w:r>
+              <w:rPr>
+                <w:rFonts w:ascii="Calibri" w:hAnsi="Calibri" w:cs="Calibri"/>
+                <w:sz w:val="20"/>
+                <w:szCs w:val="20"/>
+              </w:rPr>
+              <w:t xml:space="preserve"> and publish the verdict to the integrator</w:t>
+            </w:r>
+            <w:r>
+              <w:rPr>
+                <w:rFonts w:ascii="Calibri" w:hAnsi="Calibri" w:cs="Calibri"/>
+                <w:sz w:val="20"/>
+                <w:szCs w:val="20"/>
+              </w:rPr>
+              <w:t>.</w:t>
             </w:r>
             <w:r>
               <w:rPr>
@@ -1240,33 +1472,49 @@
                 <w:szCs w:val="20"/>
               </w:rPr>
             </w:pPr>
-          </w:p>
-        </w:tc>
-        <w:tc>
-          <w:tcPr>
-            <w:tcW w:w="0" w:type="auto"/>
-            <w:tcBorders>
-              <w:top w:val="single" w:sz="8" w:space="0" w:color="000000"/>
-              <w:left w:val="single" w:sz="8" w:space="0" w:color="000000"/>
-              <w:bottom w:val="single" w:sz="8" w:space="0" w:color="000000"/>
-              <w:right w:val="single" w:sz="8" w:space="0" w:color="000000"/>
-            </w:tcBorders>
-            <w:tcMar>
-              <w:top w:w="100" w:type="dxa"/>
-              <w:left w:w="100" w:type="dxa"/>
-              <w:bottom w:w="100" w:type="dxa"/>
-              <w:right w:w="100" w:type="dxa"/>
-            </w:tcMar>
-            <w:hideMark/>
-          </w:tcPr>
-          <w:p>
-            <w:pPr>
-              <w:rPr>
-                <w:rFonts w:ascii="Calibri" w:hAnsi="Calibri" w:cs="Calibri"/>
-                <w:sz w:val="20"/>
-                <w:szCs w:val="20"/>
-              </w:rPr>
-            </w:pPr>
+            <w:r>
+              <w:rPr>
+                <w:rFonts w:ascii="Calibri" w:hAnsi="Calibri" w:cs="Calibri"/>
+                <w:sz w:val="20"/>
+                <w:szCs w:val="20"/>
+              </w:rPr>
+              <w:t>Pass</w:t>
+            </w:r>
+          </w:p>
+        </w:tc>
+        <w:tc>
+          <w:tcPr>
+            <w:tcW w:w="0" w:type="auto"/>
+            <w:tcBorders>
+              <w:top w:val="single" w:sz="8" w:space="0" w:color="000000"/>
+              <w:left w:val="single" w:sz="8" w:space="0" w:color="000000"/>
+              <w:bottom w:val="single" w:sz="8" w:space="0" w:color="000000"/>
+              <w:right w:val="single" w:sz="8" w:space="0" w:color="000000"/>
+            </w:tcBorders>
+            <w:tcMar>
+              <w:top w:w="100" w:type="dxa"/>
+              <w:left w:w="100" w:type="dxa"/>
+              <w:bottom w:w="100" w:type="dxa"/>
+              <w:right w:w="100" w:type="dxa"/>
+            </w:tcMar>
+            <w:hideMark/>
+          </w:tcPr>
+          <w:p>
+            <w:pPr>
+              <w:rPr>
+                <w:rFonts w:ascii="Calibri" w:hAnsi="Calibri" w:cs="Calibri"/>
+                <w:sz w:val="20"/>
+                <w:szCs w:val="20"/>
+              </w:rPr>
+            </w:pPr>
+            <w:r>
+              <w:rPr>
+                <w:rFonts w:ascii="Calibri" w:hAnsi="Calibri" w:cs="Calibri"/>
+                <w:sz w:val="20"/>
+                <w:szCs w:val="20"/>
+              </w:rPr>
+              <w:t>The external partner or Scape App Engineer can export project feasibility report either in (PDF &amp; Markdown) file type.</w:t>
+            </w:r>
           </w:p>
         </w:tc>
       </w:tr>
@@ -1301,6 +1549,7 @@
                 <w:sz w:val="20"/>
                 <w:szCs w:val="20"/>
               </w:rPr>
+              <w:lastRenderedPageBreak/>
               <w:t>Extended Analysis &amp; Business Case (ROI Simulation)</w:t>
             </w:r>
           </w:p>
@@ -1372,32 +1621,48 @@
                 <w:szCs w:val="20"/>
               </w:rPr>
             </w:pPr>
-          </w:p>
-        </w:tc>
-        <w:tc>
-          <w:tcPr>
-            <w:tcW w:w="0" w:type="auto"/>
-            <w:tcBorders>
-              <w:top w:val="single" w:sz="8" w:space="0" w:color="000000"/>
-              <w:left w:val="single" w:sz="8" w:space="0" w:color="000000"/>
-              <w:bottom w:val="single" w:sz="8" w:space="0" w:color="000000"/>
-              <w:right w:val="single" w:sz="8" w:space="0" w:color="000000"/>
-            </w:tcBorders>
-            <w:tcMar>
-              <w:top w:w="100" w:type="dxa"/>
-              <w:left w:w="100" w:type="dxa"/>
-              <w:bottom w:w="100" w:type="dxa"/>
-              <w:right w:w="100" w:type="dxa"/>
-            </w:tcMar>
-          </w:tcPr>
-          <w:p>
-            <w:pPr>
-              <w:rPr>
-                <w:rFonts w:ascii="Calibri" w:hAnsi="Calibri" w:cs="Calibri"/>
-                <w:sz w:val="20"/>
-                <w:szCs w:val="20"/>
-              </w:rPr>
-            </w:pPr>
+            <w:r>
+              <w:rPr>
+                <w:rFonts w:ascii="Calibri" w:hAnsi="Calibri" w:cs="Calibri"/>
+                <w:sz w:val="20"/>
+                <w:szCs w:val="20"/>
+              </w:rPr>
+              <w:t>Fail</w:t>
+            </w:r>
+          </w:p>
+        </w:tc>
+        <w:tc>
+          <w:tcPr>
+            <w:tcW w:w="0" w:type="auto"/>
+            <w:tcBorders>
+              <w:top w:val="single" w:sz="8" w:space="0" w:color="000000"/>
+              <w:left w:val="single" w:sz="8" w:space="0" w:color="000000"/>
+              <w:bottom w:val="single" w:sz="8" w:space="0" w:color="000000"/>
+              <w:right w:val="single" w:sz="8" w:space="0" w:color="000000"/>
+            </w:tcBorders>
+            <w:tcMar>
+              <w:top w:w="100" w:type="dxa"/>
+              <w:left w:w="100" w:type="dxa"/>
+              <w:bottom w:w="100" w:type="dxa"/>
+              <w:right w:w="100" w:type="dxa"/>
+            </w:tcMar>
+          </w:tcPr>
+          <w:p>
+            <w:pPr>
+              <w:rPr>
+                <w:rFonts w:ascii="Calibri" w:hAnsi="Calibri" w:cs="Calibri"/>
+                <w:sz w:val="20"/>
+                <w:szCs w:val="20"/>
+              </w:rPr>
+            </w:pPr>
+            <w:r>
+              <w:rPr>
+                <w:rFonts w:ascii="Calibri" w:hAnsi="Calibri" w:cs="Calibri"/>
+                <w:sz w:val="20"/>
+                <w:szCs w:val="20"/>
+              </w:rPr>
+              <w:t>The system does not appropriately calculate the annual labor savings.</w:t>
+            </w:r>
           </w:p>
         </w:tc>
       </w:tr>
@@ -1503,32 +1768,48 @@
                 <w:szCs w:val="20"/>
               </w:rPr>
             </w:pPr>
-          </w:p>
-        </w:tc>
-        <w:tc>
-          <w:tcPr>
-            <w:tcW w:w="0" w:type="auto"/>
-            <w:tcBorders>
-              <w:top w:val="single" w:sz="8" w:space="0" w:color="000000"/>
-              <w:left w:val="single" w:sz="8" w:space="0" w:color="000000"/>
-              <w:bottom w:val="single" w:sz="8" w:space="0" w:color="000000"/>
-              <w:right w:val="single" w:sz="8" w:space="0" w:color="000000"/>
-            </w:tcBorders>
-            <w:tcMar>
-              <w:top w:w="100" w:type="dxa"/>
-              <w:left w:w="100" w:type="dxa"/>
-              <w:bottom w:w="100" w:type="dxa"/>
-              <w:right w:w="100" w:type="dxa"/>
-            </w:tcMar>
-          </w:tcPr>
-          <w:p>
-            <w:pPr>
-              <w:rPr>
-                <w:rFonts w:ascii="Calibri" w:hAnsi="Calibri" w:cs="Calibri"/>
-                <w:sz w:val="20"/>
-                <w:szCs w:val="20"/>
-              </w:rPr>
-            </w:pPr>
+            <w:r>
+              <w:rPr>
+                <w:rFonts w:ascii="Calibri" w:hAnsi="Calibri" w:cs="Calibri"/>
+                <w:sz w:val="20"/>
+                <w:szCs w:val="20"/>
+              </w:rPr>
+              <w:t>Pass</w:t>
+            </w:r>
+          </w:p>
+        </w:tc>
+        <w:tc>
+          <w:tcPr>
+            <w:tcW w:w="0" w:type="auto"/>
+            <w:tcBorders>
+              <w:top w:val="single" w:sz="8" w:space="0" w:color="000000"/>
+              <w:left w:val="single" w:sz="8" w:space="0" w:color="000000"/>
+              <w:bottom w:val="single" w:sz="8" w:space="0" w:color="000000"/>
+              <w:right w:val="single" w:sz="8" w:space="0" w:color="000000"/>
+            </w:tcBorders>
+            <w:tcMar>
+              <w:top w:w="100" w:type="dxa"/>
+              <w:left w:w="100" w:type="dxa"/>
+              <w:bottom w:w="100" w:type="dxa"/>
+              <w:right w:w="100" w:type="dxa"/>
+            </w:tcMar>
+          </w:tcPr>
+          <w:p>
+            <w:pPr>
+              <w:rPr>
+                <w:rFonts w:ascii="Calibri" w:hAnsi="Calibri" w:cs="Calibri"/>
+                <w:sz w:val="20"/>
+                <w:szCs w:val="20"/>
+              </w:rPr>
+            </w:pPr>
+            <w:r>
+              <w:rPr>
+                <w:rFonts w:ascii="Calibri" w:hAnsi="Calibri" w:cs="Calibri"/>
+                <w:sz w:val="20"/>
+                <w:szCs w:val="20"/>
+              </w:rPr>
+              <w:t xml:space="preserve">The external partner can delete any previously created project from the dashboard whereas evaluator can deactivate the project card, view deleted project cards and ca do either restore or final delete from the trash.  </w:t>
+            </w:r>
           </w:p>
         </w:tc>
       </w:tr>

</xml_diff>